<commit_message>
adicionando termo web no Modelo Canvas
</commit_message>
<xml_diff>
--- a/documentacao.docx
+++ b/documentacao.docx
@@ -1632,13 +1632,9 @@
           <w:szCs w:val="28"/>
         </w:rPr>
       </w:r>
-      <w:r>
-        <w:br w:type="page"/>
-      </w:r>
     </w:p>
     <w:sdt>
       <w:sdtPr>
-        <w:id w:val="1989807184"/>
         <w:docPartObj>
           <w:docPartGallery w:val="Table of Contents"/>
           <w:docPartUnique w:val="true"/>
@@ -1658,6 +1654,9 @@
               <w:color w:val="auto"/>
             </w:rPr>
           </w:pPr>
+          <w:r>
+            <w:br w:type="page"/>
+          </w:r>
           <w:r>
             <w:rPr>
               <w:rFonts w:cs="Arial" w:ascii="Arial" w:hAnsi="Arial"/>
@@ -1687,6 +1686,7 @@
           <w:r>
             <w:rPr>
               <w:rStyle w:val="IndexLink"/>
+              <w:vanish w:val="false"/>
               <w:webHidden/>
             </w:rPr>
             <w:instrText xml:space="preserve"> TOC \z \o "1-9" \u \h</w:instrText>
@@ -1694,6 +1694,7 @@
           <w:r>
             <w:rPr>
               <w:rStyle w:val="IndexLink"/>
+              <w:vanish w:val="false"/>
               <w:webHidden/>
             </w:rPr>
             <w:fldChar w:fldCharType="separate"/>
@@ -1701,6 +1702,14 @@
           <w:hyperlink w:anchor="_Toc1954760037">
             <w:r>
               <w:rPr>
+                <w:rStyle w:val="IndexLink"/>
+                <w:vanish w:val="false"/>
+                <w:webHidden/>
+              </w:rPr>
+              <w:t>1</w:t>
+            </w:r>
+            <w:r>
+              <w:rPr>
                 <w:webHidden/>
               </w:rPr>
               <w:fldChar w:fldCharType="begin"/>
@@ -1720,9 +1729,8 @@
             <w:r>
               <w:rPr>
                 <w:rStyle w:val="IndexLink"/>
-                <w:webHidden/>
-              </w:rPr>
-              <w:t>1</w:t>
+                <w:vanish w:val="false"/>
+              </w:rPr>
               <w:tab/>
               <w:t>descrição DA APLICAÇÃO</w:t>
               <w:tab/>
@@ -1769,6 +1777,7 @@
             <w:r>
               <w:rPr>
                 <w:rStyle w:val="IndexLink"/>
+                <w:vanish w:val="false"/>
                 <w:webHidden/>
               </w:rPr>
               <w:t>1.1</w:t>
@@ -1818,6 +1827,7 @@
             <w:r>
               <w:rPr>
                 <w:rStyle w:val="IndexLink"/>
+                <w:vanish w:val="false"/>
                 <w:webHidden/>
               </w:rPr>
               <w:t>1.2</w:t>
@@ -1867,6 +1877,7 @@
             <w:r>
               <w:rPr>
                 <w:rStyle w:val="IndexLink"/>
+                <w:vanish w:val="false"/>
                 <w:webHidden/>
               </w:rPr>
               <w:t>2</w:t>
@@ -1916,6 +1927,7 @@
             <w:r>
               <w:rPr>
                 <w:rStyle w:val="IndexLink"/>
+                <w:vanish w:val="false"/>
                 <w:webHidden/>
               </w:rPr>
               <w:t>2.1</w:t>
@@ -1965,6 +1977,7 @@
             <w:r>
               <w:rPr>
                 <w:rStyle w:val="IndexLink"/>
+                <w:vanish w:val="false"/>
                 <w:webHidden/>
               </w:rPr>
               <w:t>2.2</w:t>
@@ -2014,6 +2027,7 @@
             <w:r>
               <w:rPr>
                 <w:rStyle w:val="IndexLink"/>
+                <w:vanish w:val="false"/>
                 <w:webHidden/>
               </w:rPr>
               <w:t>3</w:t>
@@ -2063,6 +2077,7 @@
             <w:r>
               <w:rPr>
                 <w:rStyle w:val="IndexLink"/>
+                <w:vanish w:val="false"/>
                 <w:webHidden/>
               </w:rPr>
               <w:t>3.1</w:t>
@@ -2112,6 +2127,7 @@
             <w:r>
               <w:rPr>
                 <w:rStyle w:val="IndexLink"/>
+                <w:vanish w:val="false"/>
                 <w:webHidden/>
               </w:rPr>
               <w:t>3.2</w:t>
@@ -2161,6 +2177,7 @@
             <w:r>
               <w:rPr>
                 <w:rStyle w:val="IndexLink"/>
+                <w:vanish w:val="false"/>
                 <w:webHidden/>
               </w:rPr>
               <w:t>3.2.1</w:t>
@@ -2210,6 +2227,7 @@
             <w:r>
               <w:rPr>
                 <w:rStyle w:val="IndexLink"/>
+                <w:vanish w:val="false"/>
                 <w:webHidden/>
               </w:rPr>
               <w:t>3.2.2</w:t>
@@ -2259,6 +2277,7 @@
             <w:r>
               <w:rPr>
                 <w:rStyle w:val="IndexLink"/>
+                <w:vanish w:val="false"/>
                 <w:webHidden/>
               </w:rPr>
               <w:t>3.2.3</w:t>
@@ -2308,6 +2327,7 @@
             <w:r>
               <w:rPr>
                 <w:rStyle w:val="IndexLink"/>
+                <w:vanish w:val="false"/>
                 <w:webHidden/>
               </w:rPr>
               <w:t>3.2.4</w:t>
@@ -2357,6 +2377,7 @@
             <w:r>
               <w:rPr>
                 <w:rStyle w:val="IndexLink"/>
+                <w:vanish w:val="false"/>
                 <w:webHidden/>
               </w:rPr>
               <w:t>3.2.5</w:t>
@@ -2406,6 +2427,7 @@
             <w:r>
               <w:rPr>
                 <w:rStyle w:val="IndexLink"/>
+                <w:vanish w:val="false"/>
                 <w:webHidden/>
               </w:rPr>
               <w:t>3.2.6</w:t>
@@ -2455,6 +2477,7 @@
             <w:r>
               <w:rPr>
                 <w:rStyle w:val="IndexLink"/>
+                <w:vanish w:val="false"/>
                 <w:webHidden/>
               </w:rPr>
               <w:t>3.2.7</w:t>
@@ -2504,6 +2527,7 @@
             <w:r>
               <w:rPr>
                 <w:rStyle w:val="IndexLink"/>
+                <w:vanish w:val="false"/>
                 <w:webHidden/>
               </w:rPr>
               <w:t>3.2.8</w:t>
@@ -2553,6 +2577,7 @@
             <w:r>
               <w:rPr>
                 <w:rStyle w:val="IndexLink"/>
+                <w:vanish w:val="false"/>
                 <w:webHidden/>
               </w:rPr>
               <w:t>3.2.9</w:t>
@@ -2602,6 +2627,7 @@
             <w:r>
               <w:rPr>
                 <w:rStyle w:val="IndexLink"/>
+                <w:vanish w:val="false"/>
                 <w:webHidden/>
               </w:rPr>
               <w:t>3.2.10</w:t>
@@ -2651,6 +2677,7 @@
             <w:r>
               <w:rPr>
                 <w:rStyle w:val="IndexLink"/>
+                <w:vanish w:val="false"/>
                 <w:webHidden/>
               </w:rPr>
               <w:t>3.2.11</w:t>
@@ -2700,6 +2727,7 @@
             <w:r>
               <w:rPr>
                 <w:rStyle w:val="IndexLink"/>
+                <w:vanish w:val="false"/>
                 <w:webHidden/>
               </w:rPr>
               <w:t>3.2.12</w:t>
@@ -2749,6 +2777,7 @@
             <w:r>
               <w:rPr>
                 <w:rStyle w:val="IndexLink"/>
+                <w:vanish w:val="false"/>
                 <w:webHidden/>
               </w:rPr>
               <w:t>3.2.13</w:t>
@@ -2798,6 +2827,7 @@
             <w:r>
               <w:rPr>
                 <w:rStyle w:val="IndexLink"/>
+                <w:vanish w:val="false"/>
                 <w:webHidden/>
               </w:rPr>
               <w:t>3.2.14</w:t>
@@ -2847,6 +2877,7 @@
             <w:r>
               <w:rPr>
                 <w:rStyle w:val="IndexLink"/>
+                <w:vanish w:val="false"/>
                 <w:webHidden/>
               </w:rPr>
               <w:t>3.2.15</w:t>
@@ -2896,6 +2927,7 @@
             <w:r>
               <w:rPr>
                 <w:rStyle w:val="IndexLink"/>
+                <w:vanish w:val="false"/>
                 <w:webHidden/>
               </w:rPr>
               <w:t>3.3</w:t>
@@ -2945,6 +2977,7 @@
             <w:r>
               <w:rPr>
                 <w:rStyle w:val="IndexLink"/>
+                <w:vanish w:val="false"/>
                 <w:webHidden/>
               </w:rPr>
               <w:t>4</w:t>
@@ -2994,6 +3027,7 @@
             <w:r>
               <w:rPr>
                 <w:rStyle w:val="IndexLink"/>
+                <w:vanish w:val="false"/>
                 <w:webHidden/>
               </w:rPr>
               <w:t>4.3.1</w:t>
@@ -3043,6 +3077,7 @@
             <w:r>
               <w:rPr>
                 <w:rStyle w:val="IndexLink"/>
+                <w:vanish w:val="false"/>
                 <w:webHidden/>
               </w:rPr>
               <w:t>4.3.2</w:t>
@@ -3092,6 +3127,7 @@
             <w:r>
               <w:rPr>
                 <w:rStyle w:val="IndexLink"/>
+                <w:vanish w:val="false"/>
                 <w:webHidden/>
               </w:rPr>
               <w:t>4.3.3</w:t>
@@ -3141,6 +3177,7 @@
             <w:r>
               <w:rPr>
                 <w:rStyle w:val="IndexLink"/>
+                <w:vanish w:val="false"/>
                 <w:webHidden/>
               </w:rPr>
               <w:t>4.3.4</w:t>
@@ -3190,6 +3227,7 @@
             <w:r>
               <w:rPr>
                 <w:rStyle w:val="IndexLink"/>
+                <w:vanish w:val="false"/>
                 <w:webHidden/>
               </w:rPr>
               <w:t>5</w:t>
@@ -3239,6 +3277,7 @@
             <w:r>
               <w:rPr>
                 <w:rStyle w:val="IndexLink"/>
+                <w:vanish w:val="false"/>
                 <w:webHidden/>
               </w:rPr>
               <w:t>5.1</w:t>
@@ -3288,6 +3327,7 @@
             <w:r>
               <w:rPr>
                 <w:rStyle w:val="IndexLink"/>
+                <w:vanish w:val="false"/>
                 <w:webHidden/>
               </w:rPr>
               <w:t>5.2</w:t>
@@ -3337,6 +3377,7 @@
             <w:r>
               <w:rPr>
                 <w:rStyle w:val="IndexLink"/>
+                <w:vanish w:val="false"/>
                 <w:webHidden/>
               </w:rPr>
               <w:t>5.2.1</w:t>
@@ -3386,6 +3427,7 @@
             <w:r>
               <w:rPr>
                 <w:rStyle w:val="IndexLink"/>
+                <w:vanish w:val="false"/>
                 <w:webHidden/>
               </w:rPr>
               <w:t>5.2.2</w:t>
@@ -3435,6 +3477,7 @@
             <w:r>
               <w:rPr>
                 <w:rStyle w:val="IndexLink"/>
+                <w:vanish w:val="false"/>
                 <w:webHidden/>
               </w:rPr>
               <w:t>6</w:t>
@@ -3484,6 +3527,7 @@
             <w:r>
               <w:rPr>
                 <w:rStyle w:val="IndexLink"/>
+                <w:vanish w:val="false"/>
                 <w:webHidden/>
               </w:rPr>
               <w:t>6.1</w:t>
@@ -3533,6 +3577,7 @@
             <w:r>
               <w:rPr>
                 <w:rStyle w:val="IndexLink"/>
+                <w:vanish w:val="false"/>
                 <w:webHidden/>
               </w:rPr>
               <w:t>6.2</w:t>
@@ -3582,6 +3627,7 @@
             <w:r>
               <w:rPr>
                 <w:rStyle w:val="IndexLink"/>
+                <w:vanish w:val="false"/>
                 <w:webHidden/>
               </w:rPr>
               <w:t>7</w:t>
@@ -3631,6 +3677,7 @@
             <w:r>
               <w:rPr>
                 <w:rStyle w:val="IndexLink"/>
+                <w:vanish w:val="false"/>
                 <w:webHidden/>
               </w:rPr>
               <w:t>8</w:t>
@@ -3680,6 +3727,7 @@
             <w:r>
               <w:rPr>
                 <w:rStyle w:val="IndexLink"/>
+                <w:vanish w:val="false"/>
                 <w:webHidden/>
               </w:rPr>
               <w:t>8.1</w:t>
@@ -3729,6 +3777,7 @@
             <w:r>
               <w:rPr>
                 <w:rStyle w:val="IndexLink"/>
+                <w:vanish w:val="false"/>
                 <w:webHidden/>
               </w:rPr>
               <w:t>8.2</w:t>
@@ -3778,6 +3827,7 @@
             <w:r>
               <w:rPr>
                 <w:rStyle w:val="IndexLink"/>
+                <w:vanish w:val="false"/>
                 <w:webHidden/>
               </w:rPr>
               <w:t>8.3</w:t>
@@ -3827,6 +3877,7 @@
             <w:r>
               <w:rPr>
                 <w:rStyle w:val="IndexLink"/>
+                <w:vanish w:val="false"/>
                 <w:webHidden/>
               </w:rPr>
               <w:t>8.4</w:t>
@@ -3876,6 +3927,7 @@
             <w:r>
               <w:rPr>
                 <w:rStyle w:val="IndexLink"/>
+                <w:vanish w:val="false"/>
                 <w:webHidden/>
               </w:rPr>
               <w:t>8.5</w:t>
@@ -3925,6 +3977,7 @@
             <w:r>
               <w:rPr>
                 <w:rStyle w:val="IndexLink"/>
+                <w:vanish w:val="false"/>
                 <w:webHidden/>
               </w:rPr>
               <w:t>9</w:t>
@@ -3974,6 +4027,7 @@
             <w:r>
               <w:rPr>
                 <w:rStyle w:val="IndexLink"/>
+                <w:vanish w:val="false"/>
                 <w:webHidden/>
               </w:rPr>
               <w:t>10</w:t>
@@ -4023,6 +4077,7 @@
             <w:r>
               <w:rPr>
                 <w:rStyle w:val="IndexLink"/>
+                <w:vanish w:val="false"/>
                 <w:webHidden/>
               </w:rPr>
               <w:t>11</w:t>
@@ -4072,6 +4127,7 @@
             <w:r>
               <w:rPr>
                 <w:rStyle w:val="IndexLink"/>
+                <w:vanish w:val="false"/>
                 <w:webHidden/>
               </w:rPr>
               <w:t>12</w:t>
@@ -4090,6 +4146,7 @@
           <w:r>
             <w:rPr>
               <w:rStyle w:val="IndexLink"/>
+              <w:vanish w:val="false"/>
             </w:rPr>
             <w:fldChar w:fldCharType="end"/>
           </w:r>
@@ -4450,10 +4507,10 @@
         <w:jc w:val="both"/>
         <w:rPr/>
       </w:pPr>
-      <w:bookmarkStart w:id="1" w:name="_Toc1954760037"/>
-      <w:bookmarkStart w:id="2" w:name="_Toc2141103104"/>
-      <w:bookmarkStart w:id="3" w:name="_Toc41853167"/>
-      <w:bookmarkStart w:id="4" w:name="_Toc211596396"/>
+      <w:bookmarkStart w:id="1" w:name="_Toc211596396"/>
+      <w:bookmarkStart w:id="2" w:name="_Toc41853167"/>
+      <w:bookmarkStart w:id="3" w:name="_Toc2141103104"/>
+      <w:bookmarkStart w:id="4" w:name="_Toc1954760037"/>
       <w:r>
         <w:rPr/>
         <w:t>descrição DA APLICAÇÃO</w:t>
@@ -4472,10 +4529,10 @@
           <w:u w:val="none"/>
         </w:rPr>
       </w:pPr>
-      <w:bookmarkStart w:id="5" w:name="_Toc622262097"/>
-      <w:bookmarkStart w:id="6" w:name="_Toc1098247515"/>
-      <w:bookmarkStart w:id="7" w:name="_Toc1423840582"/>
-      <w:bookmarkStart w:id="8" w:name="_Toc211596397"/>
+      <w:bookmarkStart w:id="5" w:name="_Toc211596397"/>
+      <w:bookmarkStart w:id="6" w:name="_Toc1423840582"/>
+      <w:bookmarkStart w:id="7" w:name="_Toc1098247515"/>
+      <w:bookmarkStart w:id="8" w:name="_Toc622262097"/>
       <w:r>
         <w:rPr>
           <w:u w:val="none"/>
@@ -4521,10 +4578,10 @@
         <w:jc w:val="both"/>
         <w:rPr/>
       </w:pPr>
-      <w:bookmarkStart w:id="9" w:name="_Toc399870413"/>
-      <w:bookmarkStart w:id="10" w:name="_Toc1908031354"/>
-      <w:bookmarkStart w:id="11" w:name="_Toc106380087"/>
-      <w:bookmarkStart w:id="12" w:name="_Toc211596398"/>
+      <w:bookmarkStart w:id="9" w:name="_Toc211596398"/>
+      <w:bookmarkStart w:id="10" w:name="_Toc106380087"/>
+      <w:bookmarkStart w:id="11" w:name="_Toc1908031354"/>
+      <w:bookmarkStart w:id="12" w:name="_Toc399870413"/>
       <w:r>
         <w:rPr/>
         <w:t>Métodos utilizados</w:t>
@@ -4665,13 +4722,13 @@
         <w:jc w:val="both"/>
         <w:rPr/>
       </w:pPr>
-      <w:bookmarkStart w:id="13" w:name="_Toc912322828"/>
-      <w:bookmarkStart w:id="14" w:name="_Toc477177542"/>
-      <w:bookmarkStart w:id="15" w:name="_Toc401152011"/>
+      <w:bookmarkStart w:id="13" w:name="_Toc331506313"/>
+      <w:bookmarkStart w:id="14" w:name="_Toc331507621"/>
+      <w:bookmarkStart w:id="15" w:name="_Toc164755657"/>
       <w:bookmarkStart w:id="16" w:name="_Toc211596400"/>
-      <w:bookmarkStart w:id="17" w:name="_Toc164755657"/>
-      <w:bookmarkStart w:id="18" w:name="_Toc331507621"/>
-      <w:bookmarkStart w:id="19" w:name="_Toc331506313"/>
+      <w:bookmarkStart w:id="17" w:name="_Toc401152011"/>
+      <w:bookmarkStart w:id="18" w:name="_Toc477177542"/>
+      <w:bookmarkStart w:id="19" w:name="_Toc912322828"/>
       <w:r>
         <w:rPr/>
         <w:t>Objetivos</w:t>
@@ -4691,10 +4748,10 @@
         <w:jc w:val="both"/>
         <w:rPr/>
       </w:pPr>
-      <w:bookmarkStart w:id="20" w:name="_Toc72711157"/>
-      <w:bookmarkStart w:id="21" w:name="_Toc629084329"/>
-      <w:bookmarkStart w:id="22" w:name="_Toc1008859061"/>
-      <w:bookmarkStart w:id="23" w:name="_Toc211596401"/>
+      <w:bookmarkStart w:id="20" w:name="_Toc211596401"/>
+      <w:bookmarkStart w:id="21" w:name="_Toc1008859061"/>
+      <w:bookmarkStart w:id="22" w:name="_Toc629084329"/>
+      <w:bookmarkStart w:id="23" w:name="_Toc72711157"/>
       <w:r>
         <w:rPr/>
         <w:t>Geral</w:t>
@@ -4738,10 +4795,10 @@
         <w:jc w:val="both"/>
         <w:rPr/>
       </w:pPr>
-      <w:bookmarkStart w:id="24" w:name="_Toc966582957"/>
-      <w:bookmarkStart w:id="25" w:name="_Toc2064479924"/>
-      <w:bookmarkStart w:id="26" w:name="_Toc1638553144"/>
-      <w:bookmarkStart w:id="27" w:name="_Toc211596402"/>
+      <w:bookmarkStart w:id="24" w:name="_Toc211596402"/>
+      <w:bookmarkStart w:id="25" w:name="_Toc1638553144"/>
+      <w:bookmarkStart w:id="26" w:name="_Toc2064479924"/>
+      <w:bookmarkStart w:id="27" w:name="_Toc966582957"/>
       <w:r>
         <w:rPr/>
         <w:t>Específicos</w:t>
@@ -4820,12 +4877,12 @@
         <w:jc w:val="both"/>
         <w:rPr/>
       </w:pPr>
-      <w:bookmarkStart w:id="28" w:name="_Toc331507631"/>
-      <w:bookmarkStart w:id="29" w:name="_Toc331506323"/>
-      <w:bookmarkStart w:id="30" w:name="_Toc244939058"/>
-      <w:bookmarkStart w:id="31" w:name="_Toc1188912501"/>
-      <w:bookmarkStart w:id="32" w:name="_Toc1392144075"/>
-      <w:bookmarkStart w:id="33" w:name="_Toc211596403"/>
+      <w:bookmarkStart w:id="28" w:name="_Toc331506323"/>
+      <w:bookmarkStart w:id="29" w:name="_Toc331507631"/>
+      <w:bookmarkStart w:id="30" w:name="_Toc211596403"/>
+      <w:bookmarkStart w:id="31" w:name="_Toc1392144075"/>
+      <w:bookmarkStart w:id="32" w:name="_Toc1188912501"/>
+      <w:bookmarkStart w:id="33" w:name="_Toc244939058"/>
       <w:r>
         <w:rPr/>
         <w:t>DOCUMENTO DE requisitos</w:t>
@@ -4889,10 +4946,10 @@
         <w:jc w:val="both"/>
         <w:rPr/>
       </w:pPr>
-      <w:bookmarkStart w:id="34" w:name="_Toc2048016328"/>
-      <w:bookmarkStart w:id="35" w:name="_Toc1935806040"/>
-      <w:bookmarkStart w:id="36" w:name="_Toc1320297988"/>
-      <w:bookmarkStart w:id="37" w:name="_Toc211596404"/>
+      <w:bookmarkStart w:id="34" w:name="_Toc211596404"/>
+      <w:bookmarkStart w:id="35" w:name="_Toc1320297988"/>
+      <w:bookmarkStart w:id="36" w:name="_Toc1935806040"/>
+      <w:bookmarkStart w:id="37" w:name="_Toc2048016328"/>
       <w:r>
         <w:rPr/>
         <w:t>Histórias do Usuário</w:t>
@@ -5123,10 +5180,10 @@
         <w:jc w:val="both"/>
         <w:rPr/>
       </w:pPr>
-      <w:bookmarkStart w:id="38" w:name="_Toc102086012"/>
-      <w:bookmarkStart w:id="39" w:name="_Toc1930468181"/>
-      <w:bookmarkStart w:id="40" w:name="_Toc153609185"/>
-      <w:bookmarkStart w:id="41" w:name="_Toc211596405"/>
+      <w:bookmarkStart w:id="38" w:name="_Toc211596405"/>
+      <w:bookmarkStart w:id="39" w:name="_Toc153609185"/>
+      <w:bookmarkStart w:id="40" w:name="_Toc1930468181"/>
+      <w:bookmarkStart w:id="41" w:name="_Toc102086012"/>
       <w:r>
         <w:rPr/>
         <w:t>REQUISITOS funcionais</w:t>
@@ -5839,10 +5896,10 @@
         <w:jc w:val="both"/>
         <w:rPr/>
       </w:pPr>
-      <w:bookmarkStart w:id="42" w:name="_Toc64753609"/>
-      <w:bookmarkStart w:id="43" w:name="_Toc2075275497"/>
-      <w:bookmarkStart w:id="44" w:name="_Toc1126723699"/>
-      <w:bookmarkStart w:id="45" w:name="_Toc211596428"/>
+      <w:bookmarkStart w:id="42" w:name="_Toc211596428"/>
+      <w:bookmarkStart w:id="43" w:name="_Toc1126723699"/>
+      <w:bookmarkStart w:id="44" w:name="_Toc2075275497"/>
+      <w:bookmarkStart w:id="45" w:name="_Toc64753609"/>
       <w:r>
         <w:rPr/>
         <w:t>requisitos não funcionais</w:t>
@@ -5994,10 +6051,10 @@
         <w:jc w:val="both"/>
         <w:rPr/>
       </w:pPr>
-      <w:bookmarkStart w:id="46" w:name="_Toc2006639844"/>
-      <w:bookmarkStart w:id="47" w:name="_Toc838949129"/>
-      <w:bookmarkStart w:id="48" w:name="_Toc1037188916"/>
-      <w:bookmarkStart w:id="49" w:name="_Toc211596429"/>
+      <w:bookmarkStart w:id="46" w:name="_Toc211596429"/>
+      <w:bookmarkStart w:id="47" w:name="_Toc1037188916"/>
+      <w:bookmarkStart w:id="48" w:name="_Toc838949129"/>
+      <w:bookmarkStart w:id="49" w:name="_Toc2006639844"/>
       <w:r>
         <w:rPr/>
         <w:t>Regras de negócio</w:t>
@@ -6049,9 +6106,9 @@
         <w:jc w:val="both"/>
         <w:rPr/>
       </w:pPr>
-      <w:bookmarkStart w:id="50" w:name="_Toc211595782"/>
+      <w:bookmarkStart w:id="50" w:name="_Toc211598690"/>
       <w:bookmarkStart w:id="51" w:name="_Toc214533586"/>
-      <w:bookmarkStart w:id="52" w:name="_Toc211598690"/>
+      <w:bookmarkStart w:id="52" w:name="_Toc211595782"/>
       <w:r>
         <w:rPr/>
         <w:t xml:space="preserve">Figura </w:t>
@@ -6076,8 +6133,10 @@
         <w:rPr/>
         <w:fldChar w:fldCharType="end"/>
       </w:r>
-      <w:r>
-        <w:rPr/>
+      <w:bookmarkEnd w:id="50"/>
+      <w:bookmarkEnd w:id="51"/>
+      <w:bookmarkEnd w:id="52"/>
+      <w:r>
         <w:drawing>
           <wp:anchor distT="0" distB="0" distL="0" distR="0" simplePos="0" relativeHeight="17" behindDoc="0" locked="0" layoutInCell="0" allowOverlap="1">
             <wp:simplePos x="0" y="0"/>
@@ -6125,9 +6184,6 @@
           </wp:anchor>
         </w:drawing>
       </w:r>
-      <w:bookmarkEnd w:id="50"/>
-      <w:bookmarkEnd w:id="51"/>
-      <w:bookmarkEnd w:id="52"/>
       <w:r>
         <w:rPr/>
         <w:t xml:space="preserve"> - Modelo Canvas.</w:t>
@@ -6186,10 +6242,10 @@
           <w:bCs w:val="false"/>
         </w:rPr>
       </w:pPr>
-      <w:bookmarkStart w:id="53" w:name="_Toc249011785"/>
-      <w:bookmarkStart w:id="54" w:name="_Toc190475129"/>
-      <w:bookmarkStart w:id="55" w:name="_Toc211596430"/>
-      <w:bookmarkStart w:id="56" w:name="_Toc1139073319"/>
+      <w:bookmarkStart w:id="53" w:name="_Toc1139073319"/>
+      <w:bookmarkStart w:id="54" w:name="_Toc211596430"/>
+      <w:bookmarkStart w:id="55" w:name="_Toc190475129"/>
+      <w:bookmarkStart w:id="56" w:name="_Toc249011785"/>
       <w:r>
         <w:rPr/>
         <w:t>O QUE SERÁ ELABORADO?</w:t>
@@ -6215,7 +6271,15 @@
       </w:r>
       <w:r>
         <w:rPr/>
-        <w:t>Será desenvolvida uma plataforma mobile educacional denominada Corevent. Apartir dele, administradores poderão criar eventos, gerenciar a quantidade e preço dos ingressos, datas e locais relevantes. Por outro lado, usuários poderão visualizar as informações dos eventos existentes, e realizar a compra de ingresso, se for relevante para ele. Quando o participante for entrar em um evento, ele poderá fazer o credenciamento a partir do seu dispositivo móvel.</w:t>
+        <w:t>Será desenvolvida uma plataforma mobile/</w:t>
+      </w:r>
+      <w:r>
+        <w:rPr/>
+        <w:t>web</w:t>
+      </w:r>
+      <w:r>
+        <w:rPr/>
+        <w:t xml:space="preserve"> educacional denominada Corevent. Apartir dele, administradores poderão criar eventos, gerenciar a quantidade e preço dos ingressos, datas e locais relevantes. Por outro lado, usuários poderão visualizar as informações dos eventos existentes, e realizar a compra de ingresso, se for relevante para ele. Quando o participante for entrar em um evento, ele poderá fazer o credenciamento a partir do seu dispositivo móvel.</w:t>
       </w:r>
     </w:p>
     <w:p>
@@ -6239,10 +6303,10 @@
           <w:bCs w:val="false"/>
         </w:rPr>
       </w:pPr>
-      <w:bookmarkStart w:id="57" w:name="_Toc979764428"/>
-      <w:bookmarkStart w:id="58" w:name="_Toc1344394878"/>
-      <w:bookmarkStart w:id="59" w:name="_Toc665983963"/>
-      <w:bookmarkStart w:id="60" w:name="_Toc211596431"/>
+      <w:bookmarkStart w:id="57" w:name="_Toc211596431"/>
+      <w:bookmarkStart w:id="58" w:name="_Toc665983963"/>
+      <w:bookmarkStart w:id="59" w:name="_Toc1344394878"/>
+      <w:bookmarkStart w:id="60" w:name="_Toc979764428"/>
       <w:r>
         <w:rPr/>
         <w:t>COMO SERÁ ELABORADO?</w:t>
@@ -6345,10 +6409,10 @@
           <w:bCs w:val="false"/>
         </w:rPr>
       </w:pPr>
-      <w:bookmarkStart w:id="61" w:name="_Toc1538113312"/>
-      <w:bookmarkStart w:id="62" w:name="_Toc1809103221"/>
-      <w:bookmarkStart w:id="63" w:name="_Toc1355636706"/>
-      <w:bookmarkStart w:id="64" w:name="_Toc211596432"/>
+      <w:bookmarkStart w:id="61" w:name="_Toc211596432"/>
+      <w:bookmarkStart w:id="62" w:name="_Toc1355636706"/>
+      <w:bookmarkStart w:id="63" w:name="_Toc1809103221"/>
+      <w:bookmarkStart w:id="64" w:name="_Toc1538113312"/>
       <w:r>
         <w:rPr/>
         <w:t>PARA QUEM SERÁ ELABORADO?</w:t>
@@ -6439,10 +6503,10 @@
           <w:bCs w:val="false"/>
         </w:rPr>
       </w:pPr>
-      <w:bookmarkStart w:id="65" w:name="_Toc1385172284"/>
-      <w:bookmarkStart w:id="66" w:name="_Toc755591676"/>
-      <w:bookmarkStart w:id="67" w:name="_Toc98817170"/>
-      <w:bookmarkStart w:id="68" w:name="_Toc211596433"/>
+      <w:bookmarkStart w:id="65" w:name="_Toc211596433"/>
+      <w:bookmarkStart w:id="66" w:name="_Toc98817170"/>
+      <w:bookmarkStart w:id="67" w:name="_Toc755591676"/>
+      <w:bookmarkStart w:id="68" w:name="_Toc1385172284"/>
       <w:r>
         <w:rPr/>
         <w:t>QUANTO VAI CUSTAR?</w:t>
@@ -6548,10 +6612,10 @@
           <w:lang w:val="pt-BR"/>
         </w:rPr>
       </w:pPr>
-      <w:bookmarkStart w:id="69" w:name="_Toc1533040109"/>
-      <w:bookmarkStart w:id="70" w:name="_Toc815780500"/>
-      <w:bookmarkStart w:id="71" w:name="_Toc826985949"/>
-      <w:bookmarkStart w:id="72" w:name="_Toc211596434"/>
+      <w:bookmarkStart w:id="69" w:name="_Toc211596434"/>
+      <w:bookmarkStart w:id="70" w:name="_Toc826985949"/>
+      <w:bookmarkStart w:id="71" w:name="_Toc815780500"/>
+      <w:bookmarkStart w:id="72" w:name="_Toc1533040109"/>
       <w:r>
         <w:rPr/>
         <w:t>Casos de uso</w:t>
@@ -6570,8 +6634,8 @@
         <w:jc w:val="both"/>
         <w:rPr/>
       </w:pPr>
-      <w:bookmarkStart w:id="73" w:name="_Toc214533587"/>
-      <w:bookmarkStart w:id="74" w:name="_Toc211598691"/>
+      <w:bookmarkStart w:id="73" w:name="_Toc211598691"/>
+      <w:bookmarkStart w:id="74" w:name="_Toc214533587"/>
       <w:r>
         <w:rPr/>
         <w:t xml:space="preserve">Figura </w:t>
@@ -6698,10 +6762,10 @@
         <w:jc w:val="both"/>
         <w:rPr/>
       </w:pPr>
-      <w:bookmarkStart w:id="75" w:name="_Toc125531654"/>
-      <w:bookmarkStart w:id="76" w:name="_Toc156899280"/>
-      <w:bookmarkStart w:id="77" w:name="_Toc1549683153"/>
-      <w:bookmarkStart w:id="78" w:name="_Toc211596435"/>
+      <w:bookmarkStart w:id="75" w:name="_Toc211596435"/>
+      <w:bookmarkStart w:id="76" w:name="_Toc1549683153"/>
+      <w:bookmarkStart w:id="77" w:name="_Toc156899280"/>
+      <w:bookmarkStart w:id="78" w:name="_Toc125531654"/>
       <w:r>
         <w:rPr/>
         <w:t>Casos de uso resumidos</w:t>
@@ -7209,10 +7273,10 @@
         <w:jc w:val="both"/>
         <w:rPr/>
       </w:pPr>
-      <w:bookmarkStart w:id="79" w:name="_Toc897473987"/>
-      <w:bookmarkStart w:id="80" w:name="_Toc619038882"/>
-      <w:bookmarkStart w:id="81" w:name="_Toc927531732"/>
-      <w:bookmarkStart w:id="82" w:name="_Toc211596436"/>
+      <w:bookmarkStart w:id="79" w:name="_Toc211596436"/>
+      <w:bookmarkStart w:id="80" w:name="_Toc927531732"/>
+      <w:bookmarkStart w:id="81" w:name="_Toc619038882"/>
+      <w:bookmarkStart w:id="82" w:name="_Toc897473987"/>
       <w:r>
         <w:rPr/>
         <w:t>CASOS DE USO DETALHADOS</w:t>
@@ -7229,9 +7293,9 @@
         <w:jc w:val="both"/>
         <w:rPr/>
       </w:pPr>
-      <w:bookmarkStart w:id="83" w:name="_Toc263656008"/>
+      <w:bookmarkStart w:id="83" w:name="_Toc905594936"/>
       <w:bookmarkStart w:id="84" w:name="_Toc643299625"/>
-      <w:bookmarkStart w:id="85" w:name="_Toc905594936"/>
+      <w:bookmarkStart w:id="85" w:name="_Toc263656008"/>
       <w:r>
         <w:rPr/>
         <w:t>Caso de Uso: Realizar Cadastro</w:t>
@@ -7869,9 +7933,9 @@
         <w:jc w:val="both"/>
         <w:rPr/>
       </w:pPr>
-      <w:bookmarkStart w:id="86" w:name="_Toc671496951"/>
+      <w:bookmarkStart w:id="86" w:name="_Toc315076312"/>
       <w:bookmarkStart w:id="87" w:name="_Toc88815558"/>
-      <w:bookmarkStart w:id="88" w:name="_Toc315076312"/>
+      <w:bookmarkStart w:id="88" w:name="_Toc671496951"/>
       <w:r>
         <w:rPr/>
         <w:t>Caso de Uso: Organizar Evento</w:t>
@@ -9454,10 +9518,10 @@
         <w:jc w:val="both"/>
         <w:rPr/>
       </w:pPr>
-      <w:bookmarkStart w:id="89" w:name="_Toc1745642989"/>
-      <w:bookmarkStart w:id="90" w:name="_Toc1444578306"/>
-      <w:bookmarkStart w:id="91" w:name="_Toc75493863"/>
-      <w:bookmarkStart w:id="92" w:name="_Toc211596439"/>
+      <w:bookmarkStart w:id="89" w:name="_Toc211596439"/>
+      <w:bookmarkStart w:id="90" w:name="_Toc75493863"/>
+      <w:bookmarkStart w:id="91" w:name="_Toc1444578306"/>
+      <w:bookmarkStart w:id="92" w:name="_Toc1745642989"/>
       <w:r>
         <w:rPr/>
         <w:t>Personas</w:t>
@@ -9485,9 +9549,9 @@
         <w:jc w:val="both"/>
         <w:rPr/>
       </w:pPr>
-      <w:bookmarkStart w:id="93" w:name="_Toc1852244707"/>
+      <w:bookmarkStart w:id="93" w:name="_Toc2068419887"/>
       <w:bookmarkStart w:id="94" w:name="_Toc1070876317"/>
-      <w:bookmarkStart w:id="95" w:name="_Toc2068419887"/>
+      <w:bookmarkStart w:id="95" w:name="_Toc1852244707"/>
       <w:r>
         <w:rPr/>
         <w:t>PERSONA 1 - “Participante lucas”</w:t>
@@ -9632,9 +9696,9 @@
         <w:jc w:val="both"/>
         <w:rPr/>
       </w:pPr>
-      <w:bookmarkStart w:id="97" w:name="_Toc15560502"/>
+      <w:bookmarkStart w:id="97" w:name="_Toc691174062"/>
       <w:bookmarkStart w:id="98" w:name="_Toc399356069"/>
-      <w:bookmarkStart w:id="99" w:name="_Toc691174062"/>
+      <w:bookmarkStart w:id="99" w:name="_Toc15560502"/>
       <w:r>
         <w:rPr/>
         <w:t>PERSONA 2 - “Organizadora Mariana”</w:t>
@@ -9767,8 +9831,8 @@
         <w:rPr/>
         <w:t xml:space="preserve">    </w:t>
       </w:r>
-      <w:bookmarkStart w:id="101" w:name="_Toc1441998094"/>
-      <w:bookmarkStart w:id="102" w:name="_Toc983540111"/>
+      <w:bookmarkStart w:id="101" w:name="_Toc983540111"/>
+      <w:bookmarkStart w:id="102" w:name="_Toc1441998094"/>
       <w:r>
         <w:rPr/>
         <w:t>BPMN</w:t>
@@ -10137,10 +10201,10 @@
         <w:jc w:val="both"/>
         <w:rPr/>
       </w:pPr>
-      <w:bookmarkStart w:id="103" w:name="_Toc1659163122"/>
-      <w:bookmarkStart w:id="104" w:name="_Toc1103971741"/>
-      <w:bookmarkStart w:id="105" w:name="_Toc236427104"/>
-      <w:bookmarkStart w:id="106" w:name="_Toc211596440"/>
+      <w:bookmarkStart w:id="103" w:name="_Toc211596440"/>
+      <w:bookmarkStart w:id="104" w:name="_Toc236427104"/>
+      <w:bookmarkStart w:id="105" w:name="_Toc1103971741"/>
+      <w:bookmarkStart w:id="106" w:name="_Toc1659163122"/>
       <w:r>
         <w:rPr/>
         <w:t>Estudo de viabilidade</w:t>
@@ -10166,10 +10230,10 @@
           <w:bCs/>
         </w:rPr>
       </w:pPr>
-      <w:bookmarkStart w:id="107" w:name="_Toc1701244200"/>
-      <w:bookmarkStart w:id="108" w:name="_Toc229789503"/>
-      <w:bookmarkStart w:id="109" w:name="_Toc1802712037"/>
-      <w:bookmarkStart w:id="110" w:name="_Toc211596441"/>
+      <w:bookmarkStart w:id="107" w:name="_Toc211596441"/>
+      <w:bookmarkStart w:id="108" w:name="_Toc1802712037"/>
+      <w:bookmarkStart w:id="109" w:name="_Toc229789503"/>
+      <w:bookmarkStart w:id="110" w:name="_Toc1701244200"/>
       <w:r>
         <w:rPr>
           <w:rFonts w:eastAsia="Arial"/>
@@ -10211,28 +10275,13 @@
         <w:rPr/>
         <w:br/>
         <w:tab/>
-      </w:r>
-      <w:r>
-        <w:rPr/>
         <w:t xml:space="preserve">Para o mobile, a linguagem escolhida será o Flutter, </w:t>
       </w:r>
       <w:r>
         <w:rPr>
           <w:rFonts w:eastAsia="Arial" w:cs="Arial"/>
         </w:rPr>
-        <w:t xml:space="preserve"> </w:t>
-      </w:r>
-      <w:r>
-        <w:rPr>
-          <w:rFonts w:eastAsia="Arial" w:cs="Arial"/>
-        </w:rPr>
-        <w:t>para o Painel Web será React</w:t>
-      </w:r>
-      <w:r>
-        <w:rPr>
-          <w:rFonts w:eastAsia="Arial" w:cs="Arial"/>
-        </w:rPr>
-        <w:t>, Node.js com o framework NestJS para a API e PostgreSQL para o banco de dados.</w:t>
+        <w:t xml:space="preserve"> para o Painel Web será React, Node.js com o framework NestJS para a API e PostgreSQL para o banco de dados.</w:t>
       </w:r>
     </w:p>
     <w:p>
@@ -10290,10 +10339,10 @@
           <w:rFonts w:eastAsia="Arial" w:cs="Arial"/>
         </w:rPr>
       </w:pPr>
-      <w:bookmarkStart w:id="111" w:name="_Toc2026788046"/>
-      <w:bookmarkStart w:id="112" w:name="_Toc1262068914"/>
-      <w:bookmarkStart w:id="113" w:name="_Toc1271744004"/>
-      <w:bookmarkStart w:id="114" w:name="_Toc211596442"/>
+      <w:bookmarkStart w:id="111" w:name="_Toc211596442"/>
+      <w:bookmarkStart w:id="112" w:name="_Toc1271744004"/>
+      <w:bookmarkStart w:id="113" w:name="_Toc1262068914"/>
+      <w:bookmarkStart w:id="114" w:name="_Toc2026788046"/>
       <w:r>
         <w:rPr>
           <w:rFonts w:eastAsia="Arial"/>
@@ -10429,10 +10478,10 @@
           <w:rFonts w:eastAsia="Arial" w:cs="Arial"/>
         </w:rPr>
       </w:pPr>
-      <w:bookmarkStart w:id="115" w:name="_Toc2048398507"/>
-      <w:bookmarkStart w:id="116" w:name="_Toc956284135"/>
-      <w:bookmarkStart w:id="117" w:name="_Toc1362769093"/>
-      <w:bookmarkStart w:id="118" w:name="_Toc211596443"/>
+      <w:bookmarkStart w:id="115" w:name="_Toc211596443"/>
+      <w:bookmarkStart w:id="116" w:name="_Toc1362769093"/>
+      <w:bookmarkStart w:id="117" w:name="_Toc956284135"/>
+      <w:bookmarkStart w:id="118" w:name="_Toc2048398507"/>
       <w:r>
         <w:rPr>
           <w:rFonts w:eastAsia="Arial"/>
@@ -10526,10 +10575,10 @@
           <w:rFonts w:eastAsia="Arial" w:cs="Arial"/>
         </w:rPr>
       </w:pPr>
-      <w:bookmarkStart w:id="119" w:name="_Toc1750400205"/>
-      <w:bookmarkStart w:id="120" w:name="_Toc1556068242"/>
-      <w:bookmarkStart w:id="121" w:name="_Toc211596444"/>
-      <w:bookmarkStart w:id="122" w:name="_Toc1590650649"/>
+      <w:bookmarkStart w:id="119" w:name="_Toc1590650649"/>
+      <w:bookmarkStart w:id="120" w:name="_Toc211596444"/>
+      <w:bookmarkStart w:id="121" w:name="_Toc1556068242"/>
+      <w:bookmarkStart w:id="122" w:name="_Toc1750400205"/>
       <w:r>
         <w:rPr>
           <w:rFonts w:eastAsia="Arial"/>
@@ -10617,10 +10666,10 @@
           <w:rFonts w:eastAsia="Arial" w:cs="Arial"/>
         </w:rPr>
       </w:pPr>
-      <w:bookmarkStart w:id="123" w:name="_Toc513793304"/>
-      <w:bookmarkStart w:id="124" w:name="_Toc850055013"/>
-      <w:bookmarkStart w:id="125" w:name="_Toc2014560598"/>
-      <w:bookmarkStart w:id="126" w:name="_Toc211596445"/>
+      <w:bookmarkStart w:id="123" w:name="_Toc211596445"/>
+      <w:bookmarkStart w:id="124" w:name="_Toc2014560598"/>
+      <w:bookmarkStart w:id="125" w:name="_Toc850055013"/>
+      <w:bookmarkStart w:id="126" w:name="_Toc513793304"/>
       <w:r>
         <w:rPr>
           <w:rFonts w:eastAsia="Arial"/>
@@ -10697,10 +10746,10 @@
         <w:jc w:val="both"/>
         <w:rPr/>
       </w:pPr>
-      <w:bookmarkStart w:id="127" w:name="_Toc346335800"/>
-      <w:bookmarkStart w:id="128" w:name="_Toc1010906765"/>
-      <w:bookmarkStart w:id="129" w:name="_Toc1466128924"/>
-      <w:bookmarkStart w:id="130" w:name="_Toc211596446"/>
+      <w:bookmarkStart w:id="127" w:name="_Toc211596446"/>
+      <w:bookmarkStart w:id="128" w:name="_Toc1466128924"/>
+      <w:bookmarkStart w:id="129" w:name="_Toc1010906765"/>
+      <w:bookmarkStart w:id="130" w:name="_Toc346335800"/>
       <w:r>
         <w:rPr/>
         <w:t>Modelo de dados</w:t>
@@ -10749,10 +10798,10 @@
         <w:jc w:val="both"/>
         <w:rPr/>
       </w:pPr>
-      <w:bookmarkStart w:id="131" w:name="_Toc211596447"/>
-      <w:bookmarkStart w:id="132" w:name="_Toc1671397361"/>
-      <w:bookmarkStart w:id="133" w:name="_Toc208500551"/>
-      <w:bookmarkStart w:id="134" w:name="_Toc1794341916"/>
+      <w:bookmarkStart w:id="131" w:name="_Toc1794341916"/>
+      <w:bookmarkStart w:id="132" w:name="_Toc208500551"/>
+      <w:bookmarkStart w:id="133" w:name="_Toc1671397361"/>
+      <w:bookmarkStart w:id="134" w:name="_Toc211596447"/>
       <w:r>
         <w:rPr/>
         <w:t>Design</w:t>
@@ -12288,9 +12337,9 @@
         <w:jc w:val="both"/>
         <w:rPr/>
       </w:pPr>
-      <w:bookmarkStart w:id="136" w:name="_Toc2017909151"/>
+      <w:bookmarkStart w:id="136" w:name="_Toc1295765489"/>
       <w:bookmarkStart w:id="137" w:name="_Toc864368150"/>
-      <w:bookmarkStart w:id="138" w:name="_Toc1295765489"/>
+      <w:bookmarkStart w:id="138" w:name="_Toc2017909151"/>
       <w:r>
         <w:rPr/>
         <w:t>APLICAÇão</w:t>
@@ -12307,11 +12356,7 @@
       </w:pPr>
       <w:r>
         <w:rPr/>
-        <w:t xml:space="preserve">A API do nosso projeto está hospedada em um CSP (Cloud Service Provider) </w:t>
-      </w:r>
-      <w:r>
-        <w:rPr/>
-        <w:t>da Google (Google Cloud Plataform), no serviço Cloud Run. O banco de dados atualmente está sendo hospedado no NeonDB, mas em breve também utilizará os serviços da Google. O aplicativo Web está sendo hospedado no Firebase Hosting da Google, e o aplicativo móvel pode ser acessado a partir do repositório presente no Github.</w:t>
+        <w:t>A API do nosso projeto está hospedada em um CSP (Cloud Service Provider) da Google (Google Cloud Plataform), no serviço Cloud Run. O banco de dados atualmente está sendo hospedado no NeonDB, mas em breve também utilizará os serviços da Google. O aplicativo Web está sendo hospedado no Firebase Hosting da Google, e o aplicativo móvel pode ser acessado a partir do repositório presente no Github.</w:t>
       </w:r>
     </w:p>
     <w:p>
@@ -12331,10 +12376,10 @@
         <w:jc w:val="both"/>
         <w:rPr/>
       </w:pPr>
-      <w:bookmarkStart w:id="139" w:name="_Toc415120256"/>
-      <w:bookmarkStart w:id="140" w:name="_Toc1069316357"/>
-      <w:bookmarkStart w:id="141" w:name="_Toc1490401303"/>
-      <w:bookmarkStart w:id="142" w:name="_Toc211596453"/>
+      <w:bookmarkStart w:id="139" w:name="_Toc211596453"/>
+      <w:bookmarkStart w:id="140" w:name="_Toc1490401303"/>
+      <w:bookmarkStart w:id="141" w:name="_Toc1069316357"/>
+      <w:bookmarkStart w:id="142" w:name="_Toc415120256"/>
       <w:r>
         <w:rPr/>
         <w:t>CO</w:t>
@@ -16642,6 +16687,7 @@
     <w:rsid w:val="00b63933"/>
     <w:pPr>
       <w:widowControl w:val="false"/>
+      <w:suppressAutoHyphens w:val="true"/>
       <w:bidi w:val="0"/>
       <w:spacing w:lineRule="auto" w:line="360" w:before="0" w:after="0"/>
       <w:ind w:firstLine="709"/>
@@ -16878,9 +16924,16 @@
     <w:semiHidden/>
     <w:rPr/>
   </w:style>
+  <w:style w:type="character" w:styleId="FootnoteCharactersuser">
+    <w:name w:val="Footnote Characters (user)"/>
+    <w:semiHidden/>
+    <w:qFormat/>
+    <w:rPr>
+      <w:vertAlign w:val="superscript"/>
+    </w:rPr>
+  </w:style>
   <w:style w:type="character" w:styleId="FootnoteCharacters">
     <w:name w:val="Footnote Characters"/>
-    <w:semiHidden/>
     <w:qFormat/>
     <w:rPr>
       <w:vertAlign w:val="superscript"/>
@@ -17270,7 +17323,7 @@
       <w:outlineLvl w:val="9"/>
     </w:pPr>
     <w:rPr>
-      <w:rFonts w:ascii="Cambria" w:hAnsi="Cambria" w:eastAsia="ＭＳ ゴシック" w:cs="Times New Roman" w:asciiTheme="majorHAnsi" w:cstheme="majorBidi" w:eastAsiaTheme="majorEastAsia" w:hAnsiTheme="majorHAnsi"/>
+      <w:rFonts w:ascii="Cambria" w:hAnsi="Cambria" w:eastAsia="" w:cs="" w:asciiTheme="majorHAnsi" w:cstheme="majorBidi" w:eastAsiaTheme="majorEastAsia" w:hAnsiTheme="majorHAnsi"/>
       <w:b w:val="false"/>
       <w:bCs w:val="false"/>
       <w:caps w:val="false"/>
@@ -17293,7 +17346,7 @@
       <w:contextualSpacing/>
     </w:pPr>
     <w:rPr>
-      <w:rFonts w:ascii="Cambria" w:hAnsi="Cambria" w:eastAsia="ＭＳ ゴシック" w:cs="Times New Roman" w:asciiTheme="majorAscii" w:cstheme="majorBidi" w:eastAsiaTheme="majorEastAsia" w:hAnsiTheme="majorAscii"/>
+      <w:rFonts w:ascii="Cambria" w:hAnsi="Cambria" w:eastAsia="" w:cs="" w:asciiTheme="majorAscii" w:cstheme="majorBidi" w:eastAsiaTheme="majorEastAsia" w:hAnsiTheme="majorAscii"/>
       <w:sz w:val="56"/>
       <w:szCs w:val="56"/>
     </w:rPr>

</xml_diff>